<commit_message>
Initial commit: add index.html app and BPR templates
- index.html: browser-based Yardi implementation documentation agent
- templates/: all BPR .docx modules and RFI .xlsx collection sheet

Co-Authored-By: Claude Sonnet 4.6 <noreply@anthropic.com>
</commit_message>
<xml_diff>
--- a/templates/01-_Business_Process_Requirement_-_Vendor_Cafe.docx
+++ b/templates/01-_Business_Process_Requirement_-_Vendor_Cafe.docx
@@ -507,7 +507,7 @@
                 <w:sz w:val="22"/>
                 <w:szCs w:val="22"/>
               </w:rPr>
-              <w:t>{{DATE}}</w:t>
+              <w:t>{{SESSION_DATE}}</w:t>
             </w:r>
           </w:p>
         </w:tc>
@@ -532,7 +532,7 @@
                 <w:sz w:val="22"/>
                 <w:szCs w:val="22"/>
               </w:rPr>
-              <w:t>{{CONSULTANT_NAME}}</w:t>
+              <w:t>{{WORKSHOP_OWNER}}</w:t>
             </w:r>
           </w:p>
         </w:tc>
@@ -2033,7 +2033,6 @@
       <w:r>
         <w:rPr>
           <w:rFonts w:ascii="Calibri" w:hAnsi="Calibri" w:cs="Calibri"/>
-          <w:highlight w:val="yellow"/>
         </w:rPr>
         <w:t>{{CLIENT_NAME}}</w:t>
       </w:r>

</xml_diff>

<commit_message>
Replace templates with updated .docx files
Co-Authored-By: Claude Sonnet 4.6 <noreply@anthropic.com>
</commit_message>
<xml_diff>
--- a/templates/01-_Business_Process_Requirement_-_Vendor_Cafe.docx
+++ b/templates/01-_Business_Process_Requirement_-_Vendor_Cafe.docx
@@ -154,7 +154,7 @@
                 <v:stroke joinstyle="miter"/>
                 <v:path gradientshapeok="t" o:connecttype="rect"/>
               </v:shapetype>
-              <v:shape id="Text Box 2" o:spid="_x0000_s1026" type="#_x0000_t202" style="position:absolute;margin-left:4.2pt;margin-top:113.35pt;width:444.5pt;height:154.95pt;z-index:251658240;visibility:visible;mso-wrap-style:square;mso-width-percent:0;mso-height-percent:0;mso-wrap-distance-left:9pt;mso-wrap-distance-top:0;mso-wrap-distance-right:9pt;mso-wrap-distance-bottom:0;mso-position-horizontal:absolute;mso-position-horizontal-relative:text;mso-position-vertical:absolute;mso-position-vertical-relative:text;mso-width-percent:0;mso-height-percent:0;mso-width-relative:margin;mso-height-relative:margin;v-text-anchor:middle" o:gfxdata="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" stroked="f">
+              <v:shape id="Text Box 2" o:spid="_x0000_s1026" type="#_x0000_t202" style="position:absolute;margin-left:4.2pt;margin-top:113.35pt;width:444.5pt;height:154.95pt;z-index:251658240;visibility:visible;mso-wrap-style:square;mso-width-percent:0;mso-height-percent:0;mso-wrap-distance-left:9pt;mso-wrap-distance-top:0;mso-wrap-distance-right:9pt;mso-wrap-distance-bottom:0;mso-position-horizontal:absolute;mso-position-horizontal-relative:text;mso-position-vertical:absolute;mso-position-vertical-relative:text;mso-width-percent:0;mso-height-percent:0;mso-width-relative:margin;mso-height-relative:margin;v-text-anchor:middle" o:gfxdata="UEsDBBQABgAIAAAAIQC2gziS/gAAAOEBAAATAAAAW0NvbnRlbnRfVHlwZXNdLnhtbJSRQU7DMBBF 90jcwfIWJU67QAgl6YK0S0CoHGBkTxKLZGx5TGhvj5O2G0SRWNoz/78nu9wcxkFMGNg6quQqL6RA 0s5Y6ir5vt9lD1JwBDIwOMJKHpHlpr69KfdHjyxSmriSfYz+USnWPY7AufNIadK6MEJMx9ApD/oD OlTrorhX2lFEilmcO2RdNtjC5xDF9pCuTyYBB5bi6bQ4syoJ3g9WQ0ymaiLzg5KdCXlKLjvcW893 SUOqXwnz5DrgnHtJTxOsQfEKIT7DmDSUCaxw7Rqn8787ZsmRM9e2VmPeBN4uqYvTtW7jvijg9N/y JsXecLq0q+WD6m8AAAD//wMAUEsDBBQABgAIAAAAIQA4/SH/1gAAAJQBAAALAAAAX3JlbHMvLnJl bHOkkMFqwzAMhu+DvYPRfXGawxijTi+j0GvpHsDYimMaW0Yy2fr2M4PBMnrbUb/Q94l/f/hMi1qR JVI2sOt6UJgd+ZiDgffL8ekFlFSbvV0oo4EbChzGx4f9GRdb25HMsYhqlCwG5lrLq9biZkxWOiqY 22YiTra2kYMu1l1tQD30/bPm3wwYN0x18gb45AdQl1tp5j/sFB2T0FQ7R0nTNEV3j6o9feQzro1i OWA14Fm+Q8a1a8+Bvu/d/dMb2JY5uiPbhG/ktn4cqGU/er3pcvwCAAD//wMAUEsDBBQABgAIAAAA IQBtc0M2AQIAAOoDAAAOAAAAZHJzL2Uyb0RvYy54bWysU1Fv0zAQfkfiP1h+p2mqttuiptPoVIQ0 GNLgBziOk1g4PnN2m4xfz9npugJviDxYOZ/93X3ffd7cjr1hR4Vegy15PptzpqyEWtu25N++7t9d c+aDsLUwYFXJn5Xnt9u3bzaDK9QCOjC1QkYg1heDK3kXgiuyzMtO9cLPwClLyQawF4FCbLMaxUDo vckW8/k6GwBrhyCV97R7PyX5NuE3jZLhsWm8CsyUnHoLacW0VnHNthtRtChcp+WpDfEPXfRCWyp6 hroXQbAD6r+gei0RPDRhJqHPoGm0VIkDscnnf7B56oRTiQuJ491ZJv//YOXn45P7giyM72GkASYS 3j2A/O6ZhV0nbKvuEGHolKipcB4lywbni9PVKLUvfASphk9Q05DFIUACGhvsoyrEkxE6DeD5LLoa A5O0uVovV/mKUpJy+c366nq9SjVE8XLdoQ8fFPQs/pQcaaoJXhwffIjtiOLlSKzmweh6r41JAbbV ziA7CnLAPn3TXeM6Me0mFxCGn44mvN8wjI1IFiLmVC7uJBEi70mBMFYjJaMYFdTPJAfCZDd6HvTT Af7kbCCrldz/OAhUnJmPliS9yZfL6M0ULFdXCwrwMlNdZoSVBFVyGZCzKdiFydEHh7rtqNY0Rgt3 NIhGJ4le+zp1ToZKTE/mj469jNOp1ye6/QUAAP//AwBQSwMEFAAGAAgAAAAhACj8t7HeAAAACQEA AA8AAABkcnMvZG93bnJldi54bWxMj0tPwzAQhO9I/AdrkbhRmwBpGuJUCPFQj7T07sZLEvAj2G4T +uu7nOA4O6OZb6vlZA07YIi9dxKuZwIYusbr3rUS3jfPVwWwmJTTyniHEn4wwrI+P6tUqf3o3vCw Ti2jEhdLJaFLaSg5j02HVsWZH9CR9+GDVYlkaLkOaqRya3gmRM6t6h0tdGrAxw6br/XeShhfjqun lXkVYYPN9lMcVTv5bykvL6aHe2AJp/QXhl98QoeamHZ+73RkRkJxS0EJWZbPgZFfLOZ02Um4u8lz 4HXF/39QnwAAAP//AwBQSwECLQAUAAYACAAAACEAtoM4kv4AAADhAQAAEwAAAAAAAAAAAAAAAAAA AAAAW0NvbnRlbnRfVHlwZXNdLnhtbFBLAQItABQABgAIAAAAIQA4/SH/1gAAAJQBAAALAAAAAAAA AAAAAAAAAC8BAABfcmVscy8ucmVsc1BLAQItABQABgAIAAAAIQBtc0M2AQIAAOoDAAAOAAAAAAAA AAAAAAAAAC4CAABkcnMvZTJvRG9jLnhtbFBLAQItABQABgAIAAAAIQAo/Lex3gAAAAkBAAAPAAAA AAAAAAAAAAAAAFsEAABkcnMvZG93bnJldi54bWxQSwUGAAAAAAQABADzAAAAZgUAAAAA " stroked="f">
                 <v:fill opacity="0"/>
                 <v:textbox>
                   <w:txbxContent>
@@ -222,15 +222,6 @@
             </w:pict>
           </mc:Fallback>
         </mc:AlternateContent>
-      </w:r>
-      <w:r>
-        <w:rPr>
-          <w:rFonts w:asciiTheme="minorHAnsi" w:hAnsiTheme="minorHAnsi" w:cstheme="minorHAnsi"/>
-          <w:noProof/>
-          <w:sz w:val="24"/>
-          <w:szCs w:val="24"/>
-          <w:lang w:val="en-US" w:eastAsia="en-US"/>
-        </w:rPr>
         <w:drawing>
           <wp:inline distT="0" distB="0" distL="0" distR="0" wp14:anchorId="5E0A99E4" wp14:editId="57BEA2E2">
             <wp:extent cx="5700809" cy="6877878"/>
@@ -1352,47 +1343,7 @@
           <w:sz w:val="22"/>
           <w:szCs w:val="22"/>
         </w:rPr>
-        <w:t xml:space="preserve">This document: (1) contains confidential and proprietary information; (2) is protected by copyright and other intellectual property laws; and (3) is intended solely for Yardi Systems, Inc. licensees </w:t>
-      </w:r>
-      <w:r>
-        <w:rPr>
-          <w:rFonts w:asciiTheme="minorHAnsi" w:hAnsiTheme="minorHAnsi"/>
-          <w:sz w:val="22"/>
-          <w:szCs w:val="22"/>
-        </w:rPr>
-        <w:t>about</w:t>
-      </w:r>
-      <w:r>
-        <w:rPr>
-          <w:rFonts w:asciiTheme="minorHAnsi" w:hAnsiTheme="minorHAnsi"/>
-          <w:sz w:val="22"/>
-          <w:szCs w:val="22"/>
-        </w:rPr>
-        <w:t xml:space="preserve"> their use of Ya</w:t>
-      </w:r>
-      <w:r>
-        <w:rPr>
-          <w:rFonts w:asciiTheme="minorHAnsi" w:hAnsiTheme="minorHAnsi"/>
-          <w:sz w:val="22"/>
-          <w:szCs w:val="22"/>
-        </w:rPr>
-        <w:t xml:space="preserve">rdi </w:t>
-      </w:r>
-      <w:r>
-        <w:rPr>
-          <w:rFonts w:asciiTheme="minorHAnsi" w:hAnsiTheme="minorHAnsi"/>
-          <w:sz w:val="22"/>
-          <w:szCs w:val="22"/>
-        </w:rPr>
-        <w:t>software. Use</w:t>
-      </w:r>
-      <w:r>
-        <w:rPr>
-          <w:rFonts w:asciiTheme="minorHAnsi" w:hAnsiTheme="minorHAnsi"/>
-          <w:sz w:val="22"/>
-          <w:szCs w:val="22"/>
-        </w:rPr>
-        <w:t xml:space="preserve"> of this document is subject to the terms and conditions of a Yardi Systems, Inc. software license agreement including, but not limited to, restrictions on its use and disclosure.</w:t>
+        <w:t>This document: (1) contains confidential and proprietary information; (2) is protected by copyright and other intellectual property laws; and (3) is intended solely for Yardi Systems, Inc. licensees about their use of Yardi software. Use of this document is subject to the terms and conditions of a Yardi Systems, Inc. software license agreement including, but not limited to, restrictions on its use and disclosure.</w:t>
       </w:r>
     </w:p>
     <w:p>
@@ -1544,40 +1495,10 @@
                 <w:webHidden/>
               </w:rPr>
               <w:tab/>
-            </w:r>
-            <w:r>
-              <w:rPr>
-                <w:webHidden/>
-              </w:rPr>
               <w:fldChar w:fldCharType="begin"/>
-            </w:r>
-            <w:r>
-              <w:rPr>
-                <w:webHidden/>
-              </w:rPr>
               <w:instrText xml:space="preserve"> PAGEREF _Toc222486635 \h </w:instrText>
-            </w:r>
-            <w:r>
-              <w:rPr>
-                <w:webHidden/>
-              </w:rPr>
-            </w:r>
-            <w:r>
-              <w:rPr>
-                <w:webHidden/>
-              </w:rPr>
               <w:fldChar w:fldCharType="separate"/>
-            </w:r>
-            <w:r>
-              <w:rPr>
-                <w:webHidden/>
-              </w:rPr>
               <w:t>2</w:t>
-            </w:r>
-            <w:r>
-              <w:rPr>
-                <w:webHidden/>
-              </w:rPr>
               <w:fldChar w:fldCharType="end"/>
             </w:r>
           </w:hyperlink>
@@ -1605,40 +1526,10 @@
                 <w:webHidden/>
               </w:rPr>
               <w:tab/>
-            </w:r>
-            <w:r>
-              <w:rPr>
-                <w:webHidden/>
-              </w:rPr>
               <w:fldChar w:fldCharType="begin"/>
-            </w:r>
-            <w:r>
-              <w:rPr>
-                <w:webHidden/>
-              </w:rPr>
               <w:instrText xml:space="preserve"> PAGEREF _Toc222486636 \h </w:instrText>
-            </w:r>
-            <w:r>
-              <w:rPr>
-                <w:webHidden/>
-              </w:rPr>
-            </w:r>
-            <w:r>
-              <w:rPr>
-                <w:webHidden/>
-              </w:rPr>
               <w:fldChar w:fldCharType="separate"/>
-            </w:r>
-            <w:r>
-              <w:rPr>
-                <w:webHidden/>
-              </w:rPr>
               <w:t>2</w:t>
-            </w:r>
-            <w:r>
-              <w:rPr>
-                <w:webHidden/>
-              </w:rPr>
               <w:fldChar w:fldCharType="end"/>
             </w:r>
           </w:hyperlink>
@@ -1667,40 +1558,10 @@
                 <w:webHidden/>
               </w:rPr>
               <w:tab/>
-            </w:r>
-            <w:r>
-              <w:rPr>
-                <w:webHidden/>
-              </w:rPr>
               <w:fldChar w:fldCharType="begin"/>
-            </w:r>
-            <w:r>
-              <w:rPr>
-                <w:webHidden/>
-              </w:rPr>
               <w:instrText xml:space="preserve"> PAGEREF _Toc222486637 \h </w:instrText>
-            </w:r>
-            <w:r>
-              <w:rPr>
-                <w:webHidden/>
-              </w:rPr>
-            </w:r>
-            <w:r>
-              <w:rPr>
-                <w:webHidden/>
-              </w:rPr>
               <w:fldChar w:fldCharType="separate"/>
-            </w:r>
-            <w:r>
-              <w:rPr>
-                <w:webHidden/>
-              </w:rPr>
               <w:t>2</w:t>
-            </w:r>
-            <w:r>
-              <w:rPr>
-                <w:webHidden/>
-              </w:rPr>
               <w:fldChar w:fldCharType="end"/>
             </w:r>
           </w:hyperlink>
@@ -1727,40 +1588,10 @@
                 <w:webHidden/>
               </w:rPr>
               <w:tab/>
-            </w:r>
-            <w:r>
-              <w:rPr>
-                <w:webHidden/>
-              </w:rPr>
               <w:fldChar w:fldCharType="begin"/>
-            </w:r>
-            <w:r>
-              <w:rPr>
-                <w:webHidden/>
-              </w:rPr>
               <w:instrText xml:space="preserve"> PAGEREF _Toc222486638 \h </w:instrText>
-            </w:r>
-            <w:r>
-              <w:rPr>
-                <w:webHidden/>
-              </w:rPr>
-            </w:r>
-            <w:r>
-              <w:rPr>
-                <w:webHidden/>
-              </w:rPr>
               <w:fldChar w:fldCharType="separate"/>
-            </w:r>
-            <w:r>
-              <w:rPr>
-                <w:webHidden/>
-              </w:rPr>
               <w:t>3</w:t>
-            </w:r>
-            <w:r>
-              <w:rPr>
-                <w:webHidden/>
-              </w:rPr>
               <w:fldChar w:fldCharType="end"/>
             </w:r>
           </w:hyperlink>
@@ -1787,40 +1618,10 @@
                 <w:webHidden/>
               </w:rPr>
               <w:tab/>
-            </w:r>
-            <w:r>
-              <w:rPr>
-                <w:webHidden/>
-              </w:rPr>
               <w:fldChar w:fldCharType="begin"/>
-            </w:r>
-            <w:r>
-              <w:rPr>
-                <w:webHidden/>
-              </w:rPr>
               <w:instrText xml:space="preserve"> PAGEREF _Toc222486639 \h </w:instrText>
-            </w:r>
-            <w:r>
-              <w:rPr>
-                <w:webHidden/>
-              </w:rPr>
-            </w:r>
-            <w:r>
-              <w:rPr>
-                <w:webHidden/>
-              </w:rPr>
               <w:fldChar w:fldCharType="separate"/>
-            </w:r>
-            <w:r>
-              <w:rPr>
-                <w:webHidden/>
-              </w:rPr>
               <w:t>4</w:t>
-            </w:r>
-            <w:r>
-              <w:rPr>
-                <w:webHidden/>
-              </w:rPr>
               <w:fldChar w:fldCharType="end"/>
             </w:r>
           </w:hyperlink>
@@ -1847,40 +1648,10 @@
                 <w:webHidden/>
               </w:rPr>
               <w:tab/>
-            </w:r>
-            <w:r>
-              <w:rPr>
-                <w:webHidden/>
-              </w:rPr>
               <w:fldChar w:fldCharType="begin"/>
-            </w:r>
-            <w:r>
-              <w:rPr>
-                <w:webHidden/>
-              </w:rPr>
               <w:instrText xml:space="preserve"> PAGEREF _Toc222486640 \h </w:instrText>
-            </w:r>
-            <w:r>
-              <w:rPr>
-                <w:webHidden/>
-              </w:rPr>
-            </w:r>
-            <w:r>
-              <w:rPr>
-                <w:webHidden/>
-              </w:rPr>
               <w:fldChar w:fldCharType="separate"/>
-            </w:r>
-            <w:r>
-              <w:rPr>
-                <w:webHidden/>
-              </w:rPr>
               <w:t>5</w:t>
-            </w:r>
-            <w:r>
-              <w:rPr>
-                <w:webHidden/>
-              </w:rPr>
               <w:fldChar w:fldCharType="end"/>
             </w:r>
           </w:hyperlink>
@@ -1907,40 +1678,10 @@
                 <w:webHidden/>
               </w:rPr>
               <w:tab/>
-            </w:r>
-            <w:r>
-              <w:rPr>
-                <w:webHidden/>
-              </w:rPr>
               <w:fldChar w:fldCharType="begin"/>
-            </w:r>
-            <w:r>
-              <w:rPr>
-                <w:webHidden/>
-              </w:rPr>
               <w:instrText xml:space="preserve"> PAGEREF _Toc222486641 \h </w:instrText>
-            </w:r>
-            <w:r>
-              <w:rPr>
-                <w:webHidden/>
-              </w:rPr>
-            </w:r>
-            <w:r>
-              <w:rPr>
-                <w:webHidden/>
-              </w:rPr>
               <w:fldChar w:fldCharType="separate"/>
-            </w:r>
-            <w:r>
-              <w:rPr>
-                <w:webHidden/>
-              </w:rPr>
               <w:t>9</w:t>
-            </w:r>
-            <w:r>
-              <w:rPr>
-                <w:webHidden/>
-              </w:rPr>
               <w:fldChar w:fldCharType="end"/>
             </w:r>
           </w:hyperlink>
@@ -2028,55 +1769,7 @@
         <w:rPr>
           <w:rFonts w:ascii="Calibri" w:hAnsi="Calibri" w:cs="Calibri"/>
         </w:rPr>
-        <w:t xml:space="preserve">The purpose of this document is to provide insight to </w:t>
-      </w:r>
-      <w:r>
-        <w:rPr>
-          <w:rFonts w:ascii="Calibri" w:hAnsi="Calibri" w:cs="Calibri"/>
-        </w:rPr>
-        <w:t>{{CLIENT_NAME}}</w:t>
-      </w:r>
-      <w:r>
-        <w:rPr>
-          <w:rFonts w:ascii="Calibri" w:hAnsi="Calibri" w:cs="Calibri"/>
-        </w:rPr>
-        <w:t xml:space="preserve"> </w:t>
-      </w:r>
-      <w:r>
-        <w:rPr>
-          <w:rFonts w:ascii="Calibri" w:hAnsi="Calibri" w:cs="Calibri"/>
-        </w:rPr>
-        <w:t>Business Processes and System requirements</w:t>
-      </w:r>
-      <w:r>
-        <w:rPr>
-          <w:rFonts w:ascii="Calibri" w:hAnsi="Calibri" w:cs="Calibri"/>
-        </w:rPr>
-        <w:t xml:space="preserve"> for </w:t>
-      </w:r>
-      <w:r>
-        <w:rPr>
-          <w:rFonts w:ascii="Calibri" w:hAnsi="Calibri" w:cs="Calibri"/>
-        </w:rPr>
-        <w:t xml:space="preserve">Vendor </w:t>
-      </w:r>
-      <w:r>
-        <w:rPr>
-          <w:rFonts w:ascii="Calibri" w:hAnsi="Calibri" w:cs="Calibri"/>
-        </w:rPr>
-        <w:t>Cafe</w:t>
-      </w:r>
-      <w:r>
-        <w:rPr>
-          <w:rFonts w:ascii="Calibri" w:hAnsi="Calibri" w:cs="Calibri"/>
-        </w:rPr>
-        <w:t xml:space="preserve">. Yardi </w:t>
-      </w:r>
-      <w:r>
-        <w:rPr>
-          <w:rFonts w:ascii="Calibri" w:hAnsi="Calibri" w:cs="Calibri"/>
-        </w:rPr>
-        <w:t xml:space="preserve">will use these responses to prepare a list of further interview questions and discussion sessions.  </w:t>
+        <w:t xml:space="preserve">The purpose of this document is to provide insight to {{CLIENT_NAME}} Business Processes and System requirements for Vendor Cafe. Yardi will use these responses to prepare a list of further interview questions and discussion sessions.  </w:t>
       </w:r>
     </w:p>
     <w:p>
@@ -2292,25 +1985,7 @@
                 <w:sz w:val="18"/>
                 <w:szCs w:val="18"/>
               </w:rPr>
-              <w:t xml:space="preserve">Departments involved in </w:t>
-            </w:r>
-            <w:r>
-              <w:rPr>
-                <w:rFonts w:asciiTheme="minorHAnsi" w:hAnsiTheme="minorHAnsi" w:cstheme="minorHAnsi"/>
-                <w:color w:val="000000"/>
-                <w:sz w:val="18"/>
-                <w:szCs w:val="18"/>
-              </w:rPr>
-              <w:t>short</w:t>
-            </w:r>
-            <w:r>
-              <w:rPr>
-                <w:rFonts w:asciiTheme="minorHAnsi" w:hAnsiTheme="minorHAnsi" w:cstheme="minorHAnsi"/>
-                <w:color w:val="000000"/>
-                <w:sz w:val="18"/>
-                <w:szCs w:val="18"/>
-              </w:rPr>
-              <w:t xml:space="preserve"> listing Vendors for business</w:t>
+              <w:t>Departments involved in short listing Vendors for business</w:t>
             </w:r>
           </w:p>
           <w:p>
@@ -2401,23 +2076,7 @@
                 <w:sz w:val="18"/>
                 <w:szCs w:val="18"/>
               </w:rPr>
-              <w:t xml:space="preserve">Maintenance Vendors – recommended by FM </w:t>
-            </w:r>
-            <w:r>
-              <w:rPr>
-                <w:rFonts w:asciiTheme="minorHAnsi" w:hAnsiTheme="minorHAnsi" w:cstheme="minorHAnsi"/>
-                <w:sz w:val="18"/>
-                <w:szCs w:val="18"/>
-              </w:rPr>
-              <w:t>Manager</w:t>
-            </w:r>
-            <w:r>
-              <w:rPr>
-                <w:rFonts w:asciiTheme="minorHAnsi" w:hAnsiTheme="minorHAnsi" w:cstheme="minorHAnsi"/>
-                <w:sz w:val="18"/>
-                <w:szCs w:val="18"/>
-              </w:rPr>
-              <w:t>.</w:t>
+              <w:t>Maintenance Vendors – recommended by FM Manager.</w:t>
             </w:r>
           </w:p>
           <w:p>
@@ -2439,23 +2098,7 @@
                 <w:sz w:val="18"/>
                 <w:szCs w:val="18"/>
               </w:rPr>
-              <w:t>P</w:t>
-            </w:r>
-            <w:r>
-              <w:rPr>
-                <w:rFonts w:asciiTheme="minorHAnsi" w:hAnsiTheme="minorHAnsi" w:cstheme="minorBidi"/>
-                <w:sz w:val="18"/>
-                <w:szCs w:val="18"/>
-              </w:rPr>
-              <w:t>etty cash vendors are picked directly by the buyer</w:t>
-            </w:r>
-            <w:r>
-              <w:rPr>
-                <w:rFonts w:asciiTheme="minorHAnsi" w:hAnsiTheme="minorHAnsi" w:cstheme="minorBidi"/>
-                <w:sz w:val="18"/>
-                <w:szCs w:val="18"/>
-              </w:rPr>
-              <w:t>.</w:t>
+              <w:t>Petty cash vendors are picked directly by the buyer.</w:t>
             </w:r>
           </w:p>
         </w:tc>
@@ -2505,16 +2148,7 @@
                 <w:sz w:val="18"/>
                 <w:szCs w:val="18"/>
               </w:rPr>
-              <w:t xml:space="preserve">Number of Active Vendors </w:t>
-            </w:r>
-            <w:r>
-              <w:rPr>
-                <w:rFonts w:asciiTheme="minorHAnsi" w:hAnsiTheme="minorHAnsi" w:cstheme="minorHAnsi"/>
-                <w:color w:val="000000"/>
-                <w:sz w:val="18"/>
-                <w:szCs w:val="18"/>
-              </w:rPr>
-              <w:t xml:space="preserve">in the Legacy system. </w:t>
+              <w:t xml:space="preserve">Number of Active Vendors in the Legacy system. </w:t>
             </w:r>
           </w:p>
         </w:tc>
@@ -2591,25 +2225,7 @@
                 <w:sz w:val="18"/>
                 <w:szCs w:val="18"/>
               </w:rPr>
-              <w:t xml:space="preserve">Vendor </w:t>
-            </w:r>
-            <w:r>
-              <w:rPr>
-                <w:rFonts w:asciiTheme="minorHAnsi" w:hAnsiTheme="minorHAnsi" w:cstheme="minorHAnsi"/>
-                <w:color w:val="000000"/>
-                <w:sz w:val="18"/>
-                <w:szCs w:val="18"/>
-              </w:rPr>
-              <w:t>Markets</w:t>
-            </w:r>
-            <w:r>
-              <w:rPr>
-                <w:rFonts w:asciiTheme="minorHAnsi" w:hAnsiTheme="minorHAnsi" w:cstheme="minorHAnsi"/>
-                <w:color w:val="000000"/>
-                <w:sz w:val="18"/>
-                <w:szCs w:val="18"/>
-              </w:rPr>
-              <w:t>.</w:t>
+              <w:t>Vendor Markets.</w:t>
             </w:r>
           </w:p>
           <w:p>
@@ -2846,16 +2462,7 @@
                 <w:sz w:val="18"/>
                 <w:szCs w:val="18"/>
               </w:rPr>
-              <w:t>Vendor Insurance types required</w:t>
-            </w:r>
-            <w:r>
-              <w:rPr>
-                <w:rFonts w:asciiTheme="minorHAnsi" w:hAnsiTheme="minorHAnsi" w:cstheme="minorHAnsi"/>
-                <w:color w:val="000000"/>
-                <w:sz w:val="18"/>
-                <w:szCs w:val="18"/>
-              </w:rPr>
-              <w:t xml:space="preserve"> per Vendor category</w:t>
+              <w:t>Vendor Insurance types required per Vendor category</w:t>
             </w:r>
           </w:p>
         </w:tc>
@@ -2900,23 +2507,7 @@
                 <w:sz w:val="18"/>
                 <w:szCs w:val="18"/>
               </w:rPr>
-              <w:t>Vendor insurance types can be set</w:t>
-            </w:r>
-            <w:r>
-              <w:rPr>
-                <w:rFonts w:asciiTheme="minorHAnsi" w:hAnsiTheme="minorHAnsi" w:cstheme="minorHAnsi"/>
-                <w:sz w:val="18"/>
-                <w:szCs w:val="18"/>
-              </w:rPr>
-              <w:t xml:space="preserve"> </w:t>
-            </w:r>
-            <w:r>
-              <w:rPr>
-                <w:rFonts w:asciiTheme="minorHAnsi" w:hAnsiTheme="minorHAnsi" w:cstheme="minorHAnsi"/>
-                <w:sz w:val="18"/>
-                <w:szCs w:val="18"/>
-              </w:rPr>
-              <w:t>up based on Vendor Category</w:t>
+              <w:t>Vendor insurance types can be set up based on Vendor Category</w:t>
             </w:r>
           </w:p>
           <w:p>
@@ -2985,16 +2576,7 @@
                 <w:sz w:val="18"/>
                 <w:szCs w:val="18"/>
               </w:rPr>
-              <w:t>Vendor Approval process</w:t>
-            </w:r>
-            <w:r>
-              <w:rPr>
-                <w:rFonts w:asciiTheme="minorHAnsi" w:hAnsiTheme="minorHAnsi" w:cstheme="minorHAnsi"/>
-                <w:color w:val="000000"/>
-                <w:sz w:val="18"/>
-                <w:szCs w:val="18"/>
-              </w:rPr>
-              <w:t xml:space="preserve"> per Vendor Category</w:t>
+              <w:t>Vendor Approval process per Vendor Category</w:t>
             </w:r>
           </w:p>
           <w:p>
@@ -3112,17 +2694,19 @@
                 <w:sz w:val="18"/>
                 <w:szCs w:val="18"/>
               </w:rPr>
-              <w:t xml:space="preserve">Vendor </w:t>
-            </w:r>
-            <w:r>
+              <w:t>Vendor Invitation and Profile submission Process</w:t>
+            </w:r>
+          </w:p>
+          <w:p>
+            <w:pPr>
+              <w:spacing w:before="60" w:after="60"/>
               <w:rPr>
                 <w:rFonts w:asciiTheme="minorHAnsi" w:hAnsiTheme="minorHAnsi" w:cstheme="minorHAnsi"/>
                 <w:color w:val="000000"/>
                 <w:sz w:val="18"/>
                 <w:szCs w:val="18"/>
               </w:rPr>
-              <w:t>Invitation and Profile submission</w:t>
-            </w:r>
+            </w:pPr>
             <w:r>
               <w:rPr>
                 <w:rFonts w:asciiTheme="minorHAnsi" w:hAnsiTheme="minorHAnsi" w:cstheme="minorHAnsi"/>
@@ -3130,7 +2714,7 @@
                 <w:sz w:val="18"/>
                 <w:szCs w:val="18"/>
               </w:rPr>
-              <w:t xml:space="preserve"> Process</w:t>
+              <w:t>Team and Role who would be sending Vendor Invitations?</w:t>
             </w:r>
           </w:p>
           <w:p>
@@ -3150,45 +2734,7 @@
                 <w:sz w:val="18"/>
                 <w:szCs w:val="18"/>
               </w:rPr>
-              <w:t xml:space="preserve">Team and Role who would be sending Vendor </w:t>
-            </w:r>
-            <w:r>
-              <w:rPr>
-                <w:rFonts w:asciiTheme="minorHAnsi" w:hAnsiTheme="minorHAnsi" w:cstheme="minorHAnsi"/>
-                <w:color w:val="000000"/>
-                <w:sz w:val="18"/>
-                <w:szCs w:val="18"/>
-              </w:rPr>
-              <w:t>Invitations?</w:t>
-            </w:r>
-          </w:p>
-          <w:p>
-            <w:pPr>
-              <w:spacing w:before="60" w:after="60"/>
-              <w:rPr>
-                <w:rFonts w:asciiTheme="minorHAnsi" w:hAnsiTheme="minorHAnsi" w:cstheme="minorHAnsi"/>
-                <w:color w:val="000000"/>
-                <w:sz w:val="18"/>
-                <w:szCs w:val="18"/>
-              </w:rPr>
-            </w:pPr>
-            <w:r>
-              <w:rPr>
-                <w:rFonts w:asciiTheme="minorHAnsi" w:hAnsiTheme="minorHAnsi" w:cstheme="minorHAnsi"/>
-                <w:color w:val="000000"/>
-                <w:sz w:val="18"/>
-                <w:szCs w:val="18"/>
-              </w:rPr>
-              <w:t xml:space="preserve">Mandatory documents for Vendor </w:t>
-            </w:r>
-            <w:r>
-              <w:rPr>
-                <w:rFonts w:asciiTheme="minorHAnsi" w:hAnsiTheme="minorHAnsi" w:cstheme="minorHAnsi"/>
-                <w:color w:val="000000"/>
-                <w:sz w:val="18"/>
-                <w:szCs w:val="18"/>
-              </w:rPr>
-              <w:t>registration?</w:t>
+              <w:t>Mandatory documents for Vendor registration?</w:t>
             </w:r>
           </w:p>
           <w:p>
@@ -3235,39 +2781,7 @@
                 <w:sz w:val="18"/>
                 <w:szCs w:val="18"/>
               </w:rPr>
-              <w:t xml:space="preserve">Send invitation to Short listed </w:t>
-            </w:r>
-            <w:r>
-              <w:rPr>
-                <w:rFonts w:asciiTheme="minorHAnsi" w:hAnsiTheme="minorHAnsi" w:cstheme="minorHAnsi"/>
-                <w:sz w:val="18"/>
-                <w:szCs w:val="18"/>
-              </w:rPr>
-              <w:t>Vendors</w:t>
-            </w:r>
-            <w:r>
-              <w:rPr>
-                <w:rFonts w:asciiTheme="minorHAnsi" w:hAnsiTheme="minorHAnsi" w:cstheme="minorHAnsi"/>
-                <w:sz w:val="18"/>
-                <w:szCs w:val="18"/>
-              </w:rPr>
-              <w:t xml:space="preserve"> by Procurement </w:t>
-            </w:r>
-            <w:r>
-              <w:rPr>
-                <w:rFonts w:asciiTheme="minorHAnsi" w:hAnsiTheme="minorHAnsi" w:cstheme="minorHAnsi"/>
-                <w:sz w:val="18"/>
-                <w:szCs w:val="18"/>
-              </w:rPr>
-              <w:t>Officer</w:t>
-            </w:r>
-            <w:r>
-              <w:rPr>
-                <w:rFonts w:asciiTheme="minorHAnsi" w:hAnsiTheme="minorHAnsi" w:cstheme="minorHAnsi"/>
-                <w:sz w:val="18"/>
-                <w:szCs w:val="18"/>
-              </w:rPr>
-              <w:t>.</w:t>
+              <w:t>Send invitation to Short listed Vendors by Procurement Officer.</w:t>
             </w:r>
           </w:p>
           <w:p>
@@ -3399,47 +2913,7 @@
                 <w:sz w:val="18"/>
                 <w:szCs w:val="18"/>
               </w:rPr>
-              <w:t>Vendor Activ</w:t>
-            </w:r>
-            <w:r>
-              <w:rPr>
-                <w:rFonts w:asciiTheme="minorHAnsi" w:hAnsiTheme="minorHAnsi" w:cstheme="minorHAnsi"/>
-                <w:sz w:val="18"/>
-                <w:szCs w:val="18"/>
-              </w:rPr>
-              <w:t xml:space="preserve">ates Profile by clicking on the Invitation link received in </w:t>
-            </w:r>
-            <w:r>
-              <w:rPr>
-                <w:rFonts w:asciiTheme="minorHAnsi" w:hAnsiTheme="minorHAnsi" w:cstheme="minorHAnsi"/>
-                <w:sz w:val="18"/>
-                <w:szCs w:val="18"/>
-              </w:rPr>
-              <w:t>email</w:t>
-            </w:r>
-            <w:r>
-              <w:rPr>
-                <w:rFonts w:asciiTheme="minorHAnsi" w:hAnsiTheme="minorHAnsi" w:cstheme="minorHAnsi"/>
-                <w:sz w:val="18"/>
-                <w:szCs w:val="18"/>
-              </w:rPr>
-              <w:t>. Vendor sets profile information (username=Vendor email, Password</w:t>
-            </w:r>
-            <w:r>
-              <w:rPr>
-                <w:rFonts w:asciiTheme="minorHAnsi" w:hAnsiTheme="minorHAnsi" w:cstheme="minorHAnsi"/>
-                <w:sz w:val="18"/>
-                <w:szCs w:val="18"/>
-              </w:rPr>
-              <w:t>- Vendor</w:t>
-            </w:r>
-            <w:r>
-              <w:rPr>
-                <w:rFonts w:asciiTheme="minorHAnsi" w:hAnsiTheme="minorHAnsi" w:cstheme="minorHAnsi"/>
-                <w:sz w:val="18"/>
-                <w:szCs w:val="18"/>
-              </w:rPr>
-              <w:t xml:space="preserve"> provided password)</w:t>
+              <w:t>Vendor Activates Profile by clicking on the Invitation link received in email. Vendor sets profile information (username=Vendor email, Password- Vendor provided password)</w:t>
             </w:r>
           </w:p>
           <w:p>
@@ -3493,55 +2967,7 @@
                 <w:sz w:val="18"/>
                 <w:szCs w:val="18"/>
               </w:rPr>
-              <w:t xml:space="preserve"> </w:t>
-            </w:r>
-            <w:r>
-              <w:rPr>
-                <w:rFonts w:asciiTheme="minorHAnsi" w:hAnsiTheme="minorHAnsi" w:cstheme="minorHAnsi"/>
-                <w:sz w:val="18"/>
-                <w:szCs w:val="18"/>
-              </w:rPr>
-              <w:t xml:space="preserve">- </w:t>
-            </w:r>
-            <w:r>
-              <w:rPr>
-                <w:rFonts w:asciiTheme="minorHAnsi" w:hAnsiTheme="minorHAnsi" w:cstheme="minorHAnsi"/>
-                <w:sz w:val="18"/>
-                <w:szCs w:val="18"/>
-              </w:rPr>
-              <w:t xml:space="preserve">Mandatory </w:t>
-            </w:r>
-            <w:r>
-              <w:rPr>
-                <w:rFonts w:asciiTheme="minorHAnsi" w:hAnsiTheme="minorHAnsi" w:cstheme="minorHAnsi"/>
-                <w:sz w:val="18"/>
-                <w:szCs w:val="18"/>
-              </w:rPr>
-              <w:t>Documents (</w:t>
-            </w:r>
-            <w:r>
-              <w:rPr>
-                <w:rFonts w:asciiTheme="minorHAnsi" w:hAnsiTheme="minorHAnsi" w:cstheme="minorHAnsi"/>
-                <w:sz w:val="18"/>
-                <w:szCs w:val="18"/>
-              </w:rPr>
-              <w:t xml:space="preserve">Vendor Attachments) required for </w:t>
-            </w:r>
-            <w:r>
-              <w:rPr>
-                <w:rFonts w:asciiTheme="minorHAnsi" w:hAnsiTheme="minorHAnsi" w:cstheme="minorHAnsi"/>
-                <w:sz w:val="18"/>
-                <w:szCs w:val="18"/>
-              </w:rPr>
-              <w:t>Registration</w:t>
-            </w:r>
-            <w:r>
-              <w:rPr>
-                <w:rFonts w:asciiTheme="minorHAnsi" w:hAnsiTheme="minorHAnsi" w:cstheme="minorHAnsi"/>
-                <w:sz w:val="18"/>
-                <w:szCs w:val="18"/>
-              </w:rPr>
-              <w:t xml:space="preserve"> (recommended)</w:t>
+              <w:t xml:space="preserve"> - Mandatory Documents (Vendor Attachments) required for Registration (recommended)</w:t>
             </w:r>
           </w:p>
           <w:p>
@@ -3563,47 +2989,7 @@
                 <w:sz w:val="18"/>
                 <w:szCs w:val="18"/>
               </w:rPr>
-              <w:t xml:space="preserve">RFI - </w:t>
-            </w:r>
-            <w:r>
-              <w:rPr>
-                <w:rFonts w:asciiTheme="minorHAnsi" w:hAnsiTheme="minorHAnsi" w:cstheme="minorHAnsi"/>
-                <w:sz w:val="18"/>
-                <w:szCs w:val="18"/>
-              </w:rPr>
-              <w:t xml:space="preserve">Vendor </w:t>
-            </w:r>
-            <w:r>
-              <w:rPr>
-                <w:rFonts w:asciiTheme="minorHAnsi" w:hAnsiTheme="minorHAnsi" w:cstheme="minorHAnsi"/>
-                <w:sz w:val="18"/>
-                <w:szCs w:val="18"/>
-              </w:rPr>
-              <w:t>provides insurance information (Recommended: Third Party insurance to be mandatory)</w:t>
-            </w:r>
-            <w:r>
-              <w:rPr>
-                <w:rFonts w:asciiTheme="minorHAnsi" w:hAnsiTheme="minorHAnsi" w:cstheme="minorHAnsi"/>
-                <w:sz w:val="18"/>
-                <w:szCs w:val="18"/>
-              </w:rPr>
-              <w:t xml:space="preserve"> – Relevant </w:t>
-            </w:r>
-            <w:r>
-              <w:rPr>
-                <w:rFonts w:asciiTheme="minorHAnsi" w:hAnsiTheme="minorHAnsi" w:cstheme="minorHAnsi"/>
-                <w:sz w:val="18"/>
-                <w:szCs w:val="18"/>
-              </w:rPr>
-              <w:t>Contracting</w:t>
-            </w:r>
-            <w:r>
-              <w:rPr>
-                <w:rFonts w:asciiTheme="minorHAnsi" w:hAnsiTheme="minorHAnsi" w:cstheme="minorHAnsi"/>
-                <w:sz w:val="18"/>
-                <w:szCs w:val="18"/>
-              </w:rPr>
-              <w:t xml:space="preserve"> related vendors</w:t>
+              <w:t>RFI - Vendor provides insurance information (Recommended: Third Party insurance to be mandatory) – Relevant Contracting related vendors</w:t>
             </w:r>
           </w:p>
           <w:p>
@@ -3699,15 +3085,7 @@
                 <w:color w:val="000000"/>
                 <w:szCs w:val="18"/>
               </w:rPr>
-              <w:t>Team and Role for Level 1 Vendor Profile approval</w:t>
-            </w:r>
-            <w:r>
-              <w:rPr>
-                <w:rFonts w:asciiTheme="minorHAnsi" w:hAnsiTheme="minorHAnsi" w:cstheme="minorHAnsi"/>
-                <w:color w:val="000000"/>
-                <w:szCs w:val="18"/>
-              </w:rPr>
-              <w:t xml:space="preserve"> </w:t>
+              <w:t xml:space="preserve">Team and Role for Level 1 Vendor Profile approval </w:t>
             </w:r>
             <w:r>
               <w:rPr>
@@ -3737,16 +3115,7 @@
                 <w:sz w:val="18"/>
                 <w:szCs w:val="18"/>
               </w:rPr>
-              <w:t xml:space="preserve">Vendor </w:t>
-            </w:r>
-            <w:r>
-              <w:rPr>
-                <w:rFonts w:asciiTheme="minorHAnsi" w:hAnsiTheme="minorHAnsi" w:cstheme="minorHAnsi"/>
-                <w:color w:val="000000"/>
-                <w:sz w:val="18"/>
-                <w:szCs w:val="18"/>
-              </w:rPr>
-              <w:t>Master (Level 2)</w:t>
+              <w:t>Vendor Master (Level 2)</w:t>
             </w:r>
           </w:p>
           <w:p>
@@ -3769,15 +3138,7 @@
                 <w:color w:val="000000"/>
                 <w:szCs w:val="18"/>
               </w:rPr>
-              <w:t>Approval process per Vendor Category</w:t>
-            </w:r>
-            <w:r>
-              <w:rPr>
-                <w:rFonts w:asciiTheme="minorHAnsi" w:hAnsiTheme="minorHAnsi" w:cstheme="minorHAnsi"/>
-                <w:color w:val="000000"/>
-                <w:szCs w:val="18"/>
-              </w:rPr>
-              <w:t xml:space="preserve"> </w:t>
+              <w:t xml:space="preserve">Approval process per Vendor Category </w:t>
             </w:r>
             <w:r>
               <w:rPr>
@@ -3855,15 +3216,7 @@
                 <w:sz w:val="18"/>
                 <w:szCs w:val="18"/>
               </w:rPr>
-              <w:t>Level 1 Approval</w:t>
-            </w:r>
-            <w:r>
-              <w:rPr>
-                <w:rFonts w:asciiTheme="minorHAnsi" w:hAnsiTheme="minorHAnsi" w:cstheme="minorHAnsi"/>
-                <w:sz w:val="18"/>
-                <w:szCs w:val="18"/>
-              </w:rPr>
-              <w:t xml:space="preserve"> (</w:t>
+              <w:t>Level 1 Approval (</w:t>
             </w:r>
             <w:r>
               <w:rPr>
@@ -3881,15 +3234,7 @@
                 <w:sz w:val="18"/>
                 <w:szCs w:val="18"/>
               </w:rPr>
-              <w:t>)</w:t>
-            </w:r>
-            <w:r>
-              <w:rPr>
-                <w:rFonts w:asciiTheme="minorHAnsi" w:hAnsiTheme="minorHAnsi" w:cstheme="minorHAnsi"/>
-                <w:sz w:val="18"/>
-                <w:szCs w:val="18"/>
-              </w:rPr>
-              <w:t>:</w:t>
+              <w:t>):</w:t>
             </w:r>
           </w:p>
           <w:p>
@@ -3911,15 +3256,7 @@
                 <w:sz w:val="18"/>
                 <w:szCs w:val="18"/>
               </w:rPr>
-              <w:t>Access Registration</w:t>
-            </w:r>
-            <w:r>
-              <w:rPr>
-                <w:rFonts w:asciiTheme="minorHAnsi" w:hAnsiTheme="minorHAnsi" w:cstheme="minorHAnsi"/>
-                <w:sz w:val="18"/>
-                <w:szCs w:val="18"/>
-              </w:rPr>
-              <w:t xml:space="preserve"> Dashboard</w:t>
+              <w:t>Access Registration Dashboard</w:t>
             </w:r>
           </w:p>
           <w:p>
@@ -3963,23 +3300,7 @@
                 <w:sz w:val="18"/>
                 <w:szCs w:val="18"/>
               </w:rPr>
-              <w:t xml:space="preserve">Approve the Vendor profile </w:t>
-            </w:r>
-            <w:r>
-              <w:rPr>
-                <w:rFonts w:asciiTheme="minorHAnsi" w:hAnsiTheme="minorHAnsi" w:cstheme="minorHAnsi"/>
-                <w:sz w:val="18"/>
-                <w:szCs w:val="18"/>
-              </w:rPr>
-              <w:t>to</w:t>
-            </w:r>
-            <w:r>
-              <w:rPr>
-                <w:rFonts w:asciiTheme="minorHAnsi" w:hAnsiTheme="minorHAnsi" w:cstheme="minorHAnsi"/>
-                <w:sz w:val="18"/>
-                <w:szCs w:val="18"/>
-              </w:rPr>
-              <w:t xml:space="preserve"> progress with creation of Vendor master in Voyager</w:t>
+              <w:t>Approve the Vendor profile to progress with creation of Vendor master in Voyager</w:t>
             </w:r>
           </w:p>
           <w:p>
@@ -4001,15 +3322,7 @@
                 <w:sz w:val="18"/>
                 <w:szCs w:val="18"/>
               </w:rPr>
-              <w:t>Level 2 Approval</w:t>
-            </w:r>
-            <w:r>
-              <w:rPr>
-                <w:rFonts w:asciiTheme="minorHAnsi" w:hAnsiTheme="minorHAnsi" w:cstheme="minorHAnsi"/>
-                <w:sz w:val="18"/>
-                <w:szCs w:val="18"/>
-              </w:rPr>
-              <w:t xml:space="preserve"> (</w:t>
+              <w:t>Level 2 Approval (</w:t>
             </w:r>
             <w:r>
               <w:rPr>
@@ -4019,33 +3332,15 @@
                 <w:sz w:val="18"/>
                 <w:szCs w:val="18"/>
               </w:rPr>
-              <w:t>P2P</w:t>
-            </w:r>
-            <w:r>
-              <w:rPr>
-                <w:rFonts w:asciiTheme="minorHAnsi" w:hAnsiTheme="minorHAnsi" w:cstheme="minorHAnsi"/>
-                <w:b/>
-                <w:bCs/>
-                <w:sz w:val="18"/>
-                <w:szCs w:val="18"/>
-              </w:rPr>
-              <w:t xml:space="preserve"> Elevate</w:t>
-            </w:r>
-            <w:r>
-              <w:rPr>
-                <w:rFonts w:asciiTheme="minorHAnsi" w:hAnsiTheme="minorHAnsi" w:cstheme="minorHAnsi"/>
-                <w:sz w:val="18"/>
-                <w:szCs w:val="18"/>
-              </w:rPr>
-              <w:t>)</w:t>
-            </w:r>
-            <w:r>
-              <w:rPr>
-                <w:rFonts w:asciiTheme="minorHAnsi" w:hAnsiTheme="minorHAnsi" w:cstheme="minorHAnsi"/>
-                <w:sz w:val="18"/>
-                <w:szCs w:val="18"/>
-              </w:rPr>
-              <w:t>:</w:t>
+              <w:t>P2P Elevate</w:t>
+            </w:r>
+            <w:r>
+              <w:rPr>
+                <w:rFonts w:asciiTheme="minorHAnsi" w:hAnsiTheme="minorHAnsi" w:cstheme="minorHAnsi"/>
+                <w:sz w:val="18"/>
+                <w:szCs w:val="18"/>
+              </w:rPr>
+              <w:t>):</w:t>
             </w:r>
           </w:p>
           <w:p>
@@ -4067,15 +3362,7 @@
                 <w:sz w:val="18"/>
                 <w:szCs w:val="18"/>
               </w:rPr>
-              <w:t>Approve Vendor master as per the DOA</w:t>
-            </w:r>
-            <w:r>
-              <w:rPr>
-                <w:rFonts w:asciiTheme="minorHAnsi" w:hAnsiTheme="minorHAnsi" w:cstheme="minorHAnsi"/>
-                <w:sz w:val="18"/>
-                <w:szCs w:val="18"/>
-              </w:rPr>
-              <w:t xml:space="preserve"> (</w:t>
+              <w:t>Approve Vendor master as per the DOA (</w:t>
             </w:r>
             <w:r>
               <w:rPr>
@@ -4143,25 +3430,7 @@
                 <w:sz w:val="18"/>
                 <w:szCs w:val="18"/>
               </w:rPr>
-              <w:t xml:space="preserve">Registration process for </w:t>
-            </w:r>
-            <w:r>
-              <w:rPr>
-                <w:rFonts w:asciiTheme="minorHAnsi" w:hAnsiTheme="minorHAnsi" w:cstheme="minorHAnsi"/>
-                <w:color w:val="000000"/>
-                <w:sz w:val="18"/>
-                <w:szCs w:val="18"/>
-              </w:rPr>
-              <w:t>Existing</w:t>
-            </w:r>
-            <w:r>
-              <w:rPr>
-                <w:rFonts w:asciiTheme="minorHAnsi" w:hAnsiTheme="minorHAnsi" w:cstheme="minorHAnsi"/>
-                <w:color w:val="000000"/>
-                <w:sz w:val="18"/>
-                <w:szCs w:val="18"/>
-              </w:rPr>
-              <w:t xml:space="preserve"> Vendors</w:t>
+              <w:t>Registration process for Existing Vendors</w:t>
             </w:r>
           </w:p>
         </w:tc>
@@ -4188,31 +3457,7 @@
                 <w:sz w:val="18"/>
                 <w:szCs w:val="18"/>
               </w:rPr>
-              <w:t xml:space="preserve">For all </w:t>
-            </w:r>
-            <w:r>
-              <w:rPr>
-                <w:rFonts w:asciiTheme="minorHAnsi" w:hAnsiTheme="minorHAnsi" w:cstheme="minorHAnsi"/>
-                <w:sz w:val="18"/>
-                <w:szCs w:val="18"/>
-              </w:rPr>
-              <w:t>Existing</w:t>
-            </w:r>
-            <w:r>
-              <w:rPr>
-                <w:rFonts w:asciiTheme="minorHAnsi" w:hAnsiTheme="minorHAnsi" w:cstheme="minorHAnsi"/>
-                <w:sz w:val="18"/>
-                <w:szCs w:val="18"/>
-              </w:rPr>
-              <w:t xml:space="preserve"> vendors which need to be registered in Vendor portal, dispatch invitation </w:t>
-            </w:r>
-            <w:r>
-              <w:rPr>
-                <w:rFonts w:asciiTheme="minorHAnsi" w:hAnsiTheme="minorHAnsi" w:cstheme="minorHAnsi"/>
-                <w:sz w:val="18"/>
-                <w:szCs w:val="18"/>
-              </w:rPr>
-              <w:t>emails in bulk</w:t>
+              <w:t>For all Existing vendors which need to be registered in Vendor portal, dispatch invitation emails in bulk</w:t>
             </w:r>
           </w:p>
           <w:p>
@@ -4234,23 +3479,7 @@
                 <w:sz w:val="18"/>
                 <w:szCs w:val="18"/>
               </w:rPr>
-              <w:t xml:space="preserve">All steps explained above </w:t>
-            </w:r>
-            <w:r>
-              <w:rPr>
-                <w:rFonts w:asciiTheme="minorHAnsi" w:hAnsiTheme="minorHAnsi" w:cstheme="minorHAnsi"/>
-                <w:sz w:val="18"/>
-                <w:szCs w:val="18"/>
-              </w:rPr>
-              <w:t>remain</w:t>
-            </w:r>
-            <w:r>
-              <w:rPr>
-                <w:rFonts w:asciiTheme="minorHAnsi" w:hAnsiTheme="minorHAnsi" w:cstheme="minorHAnsi"/>
-                <w:sz w:val="18"/>
-                <w:szCs w:val="18"/>
-              </w:rPr>
-              <w:t xml:space="preserve"> same until level 1 Approval</w:t>
+              <w:t>All steps explained above remain same until level 1 Approval</w:t>
             </w:r>
           </w:p>
           <w:p>
@@ -4272,15 +3501,7 @@
                 <w:sz w:val="18"/>
                 <w:szCs w:val="18"/>
               </w:rPr>
-              <w:t xml:space="preserve">Level 2 approval is not required, since they are migrated in system </w:t>
-            </w:r>
-            <w:r>
-              <w:rPr>
-                <w:rFonts w:asciiTheme="minorHAnsi" w:hAnsiTheme="minorHAnsi" w:cstheme="minorHAnsi"/>
-                <w:sz w:val="18"/>
-                <w:szCs w:val="18"/>
-              </w:rPr>
-              <w:t>as Approved vendors</w:t>
+              <w:t>Level 2 approval is not required, since they are migrated in system as Approved vendors</w:t>
             </w:r>
           </w:p>
           <w:p>
@@ -4389,15 +3610,7 @@
                 <w:sz w:val="18"/>
                 <w:szCs w:val="18"/>
               </w:rPr>
-              <w:t>Utility payment vendors like DEWA</w:t>
-            </w:r>
-            <w:r>
-              <w:rPr>
-                <w:rFonts w:asciiTheme="minorHAnsi" w:hAnsiTheme="minorHAnsi" w:cstheme="minorHAnsi"/>
-                <w:sz w:val="18"/>
-                <w:szCs w:val="18"/>
-              </w:rPr>
-              <w:t xml:space="preserve"> &amp; ADEWA</w:t>
+              <w:t>Utility payment vendors like DEWA &amp; ADEWA</w:t>
             </w:r>
           </w:p>
           <w:p>
@@ -4419,23 +3632,7 @@
                 <w:sz w:val="18"/>
                 <w:szCs w:val="18"/>
               </w:rPr>
-              <w:t xml:space="preserve">Government entities </w:t>
-            </w:r>
-            <w:r>
-              <w:rPr>
-                <w:rFonts w:asciiTheme="minorHAnsi" w:hAnsiTheme="minorHAnsi" w:cstheme="minorHAnsi"/>
-                <w:sz w:val="18"/>
-                <w:szCs w:val="18"/>
-              </w:rPr>
-              <w:t>–</w:t>
-            </w:r>
-            <w:r>
-              <w:rPr>
-                <w:rFonts w:asciiTheme="minorHAnsi" w:hAnsiTheme="minorHAnsi" w:cstheme="minorHAnsi"/>
-                <w:sz w:val="18"/>
-                <w:szCs w:val="18"/>
-              </w:rPr>
-              <w:t xml:space="preserve"> Ejari</w:t>
+              <w:t>Government entities – Ejari</w:t>
             </w:r>
           </w:p>
           <w:p>
@@ -4457,15 +3654,7 @@
                 <w:sz w:val="18"/>
                 <w:szCs w:val="18"/>
               </w:rPr>
-              <w:t>Petty Cash Vendors</w:t>
-            </w:r>
-            <w:r>
-              <w:rPr>
-                <w:rFonts w:asciiTheme="minorHAnsi" w:hAnsiTheme="minorHAnsi" w:cstheme="minorHAnsi"/>
-                <w:sz w:val="18"/>
-                <w:szCs w:val="18"/>
-              </w:rPr>
-              <w:t xml:space="preserve"> (internal Vendors)</w:t>
+              <w:t>Petty Cash Vendors (internal Vendors)</w:t>
             </w:r>
           </w:p>
           <w:p>
@@ -4548,16 +3737,7 @@
                 <w:sz w:val="18"/>
                 <w:szCs w:val="18"/>
               </w:rPr>
-              <w:t xml:space="preserve">Teams and Roles who would create Vendor directly in </w:t>
-            </w:r>
-            <w:r>
-              <w:rPr>
-                <w:rFonts w:asciiTheme="minorHAnsi" w:hAnsiTheme="minorHAnsi" w:cstheme="minorHAnsi"/>
-                <w:color w:val="000000"/>
-                <w:sz w:val="18"/>
-                <w:szCs w:val="18"/>
-              </w:rPr>
-              <w:t>Elevate</w:t>
+              <w:t>Teams and Roles who would create Vendor directly in Elevate</w:t>
             </w:r>
           </w:p>
         </w:tc>
@@ -4580,63 +3760,7 @@
                 <w:sz w:val="18"/>
                 <w:szCs w:val="18"/>
               </w:rPr>
-              <w:t>Vendor creation</w:t>
-            </w:r>
-            <w:r>
-              <w:rPr>
-                <w:rFonts w:asciiTheme="minorHAnsi" w:hAnsiTheme="minorHAnsi" w:cstheme="minorHAnsi"/>
-                <w:sz w:val="18"/>
-                <w:szCs w:val="18"/>
-              </w:rPr>
-              <w:t xml:space="preserve"> and Approval</w:t>
-            </w:r>
-            <w:r>
-              <w:rPr>
-                <w:rFonts w:asciiTheme="minorHAnsi" w:hAnsiTheme="minorHAnsi" w:cstheme="minorHAnsi"/>
-                <w:sz w:val="18"/>
-                <w:szCs w:val="18"/>
-              </w:rPr>
-              <w:t xml:space="preserve"> in </w:t>
-            </w:r>
-            <w:r>
-              <w:rPr>
-                <w:rFonts w:asciiTheme="minorHAnsi" w:hAnsiTheme="minorHAnsi" w:cstheme="minorHAnsi"/>
-                <w:sz w:val="18"/>
-                <w:szCs w:val="18"/>
-              </w:rPr>
-              <w:t>Elevate</w:t>
-            </w:r>
-            <w:r>
-              <w:rPr>
-                <w:rFonts w:asciiTheme="minorHAnsi" w:hAnsiTheme="minorHAnsi" w:cstheme="minorHAnsi"/>
-                <w:sz w:val="18"/>
-                <w:szCs w:val="18"/>
-              </w:rPr>
-              <w:t xml:space="preserve"> is centralized process for </w:t>
-            </w:r>
-            <w:r>
-              <w:rPr>
-                <w:rFonts w:asciiTheme="minorHAnsi" w:hAnsiTheme="minorHAnsi" w:cstheme="minorHAnsi"/>
-                <w:sz w:val="18"/>
-                <w:szCs w:val="18"/>
-              </w:rPr>
-              <w:t xml:space="preserve">Procurement </w:t>
-            </w:r>
-            <w:r>
-              <w:rPr>
-                <w:rFonts w:asciiTheme="minorHAnsi" w:hAnsiTheme="minorHAnsi" w:cstheme="minorHAnsi"/>
-                <w:sz w:val="18"/>
-                <w:szCs w:val="18"/>
-              </w:rPr>
-              <w:t>team</w:t>
-            </w:r>
-            <w:r>
-              <w:rPr>
-                <w:rFonts w:asciiTheme="minorHAnsi" w:hAnsiTheme="minorHAnsi" w:cstheme="minorHAnsi"/>
-                <w:sz w:val="18"/>
-                <w:szCs w:val="18"/>
-              </w:rPr>
-              <w:t xml:space="preserve"> – some vendors are required to be created by finance where in procurement is not involved.</w:t>
+              <w:t>Vendor creation and Approval in Elevate is centralized process for Procurement team – some vendors are required to be created by finance where in procurement is not involved.</w:t>
             </w:r>
           </w:p>
           <w:p>
@@ -4677,15 +3801,7 @@
                 <w:sz w:val="18"/>
                 <w:szCs w:val="18"/>
               </w:rPr>
-              <w:t xml:space="preserve">Procurement </w:t>
-            </w:r>
-            <w:r>
-              <w:rPr>
-                <w:rFonts w:asciiTheme="minorHAnsi" w:hAnsiTheme="minorHAnsi" w:cstheme="minorHAnsi"/>
-                <w:sz w:val="18"/>
-                <w:szCs w:val="18"/>
-              </w:rPr>
-              <w:t xml:space="preserve">Officer </w:t>
+              <w:t xml:space="preserve">Procurement Officer </w:t>
             </w:r>
           </w:p>
           <w:p>
@@ -4865,16 +3981,7 @@
                 <w:sz w:val="18"/>
                 <w:szCs w:val="18"/>
               </w:rPr>
-              <w:t>Cheque</w:t>
-            </w:r>
-            <w:r>
-              <w:rPr>
-                <w:rFonts w:asciiTheme="minorHAnsi" w:hAnsiTheme="minorHAnsi" w:cstheme="minorHAnsi"/>
-                <w:color w:val="000000"/>
-                <w:sz w:val="18"/>
-                <w:szCs w:val="18"/>
-              </w:rPr>
-              <w:t>?</w:t>
+              <w:t>Cheque?</w:t>
             </w:r>
           </w:p>
           <w:p>
@@ -4943,15 +4050,7 @@
                 <w:sz w:val="18"/>
                 <w:szCs w:val="18"/>
               </w:rPr>
-              <w:t>Cheque</w:t>
-            </w:r>
-            <w:r>
-              <w:rPr>
-                <w:rFonts w:asciiTheme="minorHAnsi" w:hAnsiTheme="minorHAnsi" w:cstheme="minorHAnsi"/>
-                <w:sz w:val="18"/>
-                <w:szCs w:val="18"/>
-              </w:rPr>
-              <w:t xml:space="preserve"> </w:t>
+              <w:t xml:space="preserve">Cheque </w:t>
             </w:r>
           </w:p>
           <w:p>
@@ -4973,23 +4072,7 @@
                 <w:sz w:val="18"/>
                 <w:szCs w:val="18"/>
               </w:rPr>
-              <w:t>E</w:t>
-            </w:r>
-            <w:r>
-              <w:rPr>
-                <w:rFonts w:asciiTheme="minorHAnsi" w:hAnsiTheme="minorHAnsi" w:cstheme="minorHAnsi"/>
-                <w:sz w:val="18"/>
-                <w:szCs w:val="18"/>
-              </w:rPr>
-              <w:t>FT</w:t>
-            </w:r>
-            <w:r>
-              <w:rPr>
-                <w:rFonts w:asciiTheme="minorHAnsi" w:hAnsiTheme="minorHAnsi" w:cstheme="minorHAnsi"/>
-                <w:sz w:val="18"/>
-                <w:szCs w:val="18"/>
-              </w:rPr>
-              <w:t xml:space="preserve"> </w:t>
+              <w:t xml:space="preserve">EFT </w:t>
             </w:r>
           </w:p>
           <w:p>
@@ -5071,7 +4154,6 @@
                 <w:szCs w:val="18"/>
               </w:rPr>
             </w:pPr>
-            <w:proofErr w:type="spellStart"/>
             <w:r>
               <w:rPr>
                 <w:rFonts w:asciiTheme="minorHAnsi" w:hAnsiTheme="minorHAnsi" w:cstheme="minorHAnsi"/>
@@ -5080,7 +4162,6 @@
               </w:rPr>
               <w:t>Noqodi</w:t>
             </w:r>
-            <w:proofErr w:type="spellEnd"/>
           </w:p>
         </w:tc>
       </w:tr>
@@ -5355,15 +4436,7 @@
                 <w:sz w:val="18"/>
                 <w:szCs w:val="18"/>
               </w:rPr>
-              <w:t xml:space="preserve">Recommended </w:t>
-            </w:r>
-            <w:r>
-              <w:rPr>
-                <w:rFonts w:asciiTheme="minorHAnsi" w:hAnsiTheme="minorHAnsi" w:cstheme="minorHAnsi"/>
-                <w:sz w:val="18"/>
-                <w:szCs w:val="18"/>
-              </w:rPr>
-              <w:t>Configurations discussed during the BPR are present in the RFI sheet.</w:t>
+              <w:t>Recommended Configurations discussed during the BPR are present in the RFI sheet.</w:t>
             </w:r>
           </w:p>
         </w:tc>
@@ -5458,15 +4531,7 @@
                 <w:sz w:val="18"/>
                 <w:szCs w:val="18"/>
               </w:rPr>
-              <w:t>Email Templates to be updated with Specific information</w:t>
-            </w:r>
-            <w:r>
-              <w:rPr>
-                <w:rFonts w:asciiTheme="minorHAnsi" w:hAnsiTheme="minorHAnsi" w:cstheme="minorBidi"/>
-                <w:sz w:val="18"/>
-                <w:szCs w:val="18"/>
-              </w:rPr>
-              <w:t>.</w:t>
+              <w:t>Email Templates to be updated with Specific information.</w:t>
             </w:r>
           </w:p>
           <w:p>
@@ -5535,16 +4600,7 @@
                 <w:sz w:val="18"/>
                 <w:szCs w:val="18"/>
               </w:rPr>
-              <w:t xml:space="preserve">Vendor </w:t>
-            </w:r>
-            <w:r>
-              <w:rPr>
-                <w:rFonts w:asciiTheme="minorHAnsi" w:hAnsiTheme="minorHAnsi" w:cstheme="minorHAnsi"/>
-                <w:color w:val="000000"/>
-                <w:sz w:val="18"/>
-                <w:szCs w:val="18"/>
-              </w:rPr>
-              <w:t>Contact Groups</w:t>
+              <w:t>Vendor Contact Groups</w:t>
             </w:r>
           </w:p>
         </w:tc>
@@ -5687,15 +4743,7 @@
                 <w:sz w:val="18"/>
                 <w:szCs w:val="18"/>
               </w:rPr>
-              <w:t>Accounts Payable</w:t>
-            </w:r>
-            <w:r>
-              <w:rPr>
-                <w:rFonts w:asciiTheme="minorHAnsi" w:hAnsiTheme="minorHAnsi" w:cstheme="minorHAnsi"/>
-                <w:sz w:val="18"/>
-                <w:szCs w:val="18"/>
-              </w:rPr>
-              <w:t xml:space="preserve"> </w:t>
+              <w:t xml:space="preserve">Accounts Payable </w:t>
             </w:r>
           </w:p>
           <w:p>
@@ -5741,15 +4789,7 @@
                 <w:sz w:val="18"/>
                 <w:szCs w:val="18"/>
               </w:rPr>
-              <w:t>Billing</w:t>
-            </w:r>
-            <w:r>
-              <w:rPr>
-                <w:rFonts w:asciiTheme="minorHAnsi" w:hAnsiTheme="minorHAnsi" w:cstheme="minorHAnsi"/>
-                <w:sz w:val="18"/>
-                <w:szCs w:val="18"/>
-              </w:rPr>
-              <w:t xml:space="preserve"> Accounts Payable </w:t>
+              <w:t xml:space="preserve">Billing Accounts Payable </w:t>
             </w:r>
           </w:p>
           <w:p>
@@ -5877,41 +4917,25 @@
                 <w:sz w:val="18"/>
                 <w:szCs w:val="18"/>
               </w:rPr>
-              <w:t>Support Phone number</w:t>
-            </w:r>
-            <w:r>
-              <w:rPr>
-                <w:rFonts w:asciiTheme="minorHAnsi" w:hAnsiTheme="minorHAnsi" w:cstheme="minorHAnsi"/>
-                <w:sz w:val="18"/>
-                <w:szCs w:val="18"/>
-              </w:rPr>
-              <w:t xml:space="preserve">: </w:t>
-            </w:r>
-          </w:p>
-          <w:p>
-            <w:pPr>
-              <w:pStyle w:val="BRDBulletedList1"/>
-              <w:rPr>
-                <w:rFonts w:asciiTheme="minorHAnsi" w:hAnsiTheme="minorHAnsi" w:cstheme="minorHAnsi"/>
-                <w:sz w:val="18"/>
-                <w:szCs w:val="18"/>
-              </w:rPr>
-            </w:pPr>
-            <w:r>
-              <w:rPr>
-                <w:rFonts w:asciiTheme="minorHAnsi" w:hAnsiTheme="minorHAnsi" w:cstheme="minorHAnsi"/>
-                <w:sz w:val="18"/>
-                <w:szCs w:val="18"/>
-              </w:rPr>
-              <w:t>Support email id</w:t>
-            </w:r>
-            <w:r>
-              <w:rPr>
-                <w:rFonts w:asciiTheme="minorHAnsi" w:hAnsiTheme="minorHAnsi" w:cstheme="minorHAnsi"/>
-                <w:sz w:val="18"/>
-                <w:szCs w:val="18"/>
-              </w:rPr>
-              <w:t xml:space="preserve">: </w:t>
+              <w:t xml:space="preserve">Support Phone number: </w:t>
+            </w:r>
+          </w:p>
+          <w:p>
+            <w:pPr>
+              <w:pStyle w:val="BRDBulletedList1"/>
+              <w:rPr>
+                <w:rFonts w:asciiTheme="minorHAnsi" w:hAnsiTheme="minorHAnsi" w:cstheme="minorHAnsi"/>
+                <w:sz w:val="18"/>
+                <w:szCs w:val="18"/>
+              </w:rPr>
+            </w:pPr>
+            <w:r>
+              <w:rPr>
+                <w:rFonts w:asciiTheme="minorHAnsi" w:hAnsiTheme="minorHAnsi" w:cstheme="minorHAnsi"/>
+                <w:sz w:val="18"/>
+                <w:szCs w:val="18"/>
+              </w:rPr>
+              <w:t xml:space="preserve">Support email id: </w:t>
             </w:r>
           </w:p>
           <w:p>
@@ -5940,23 +4964,7 @@
                 <w:sz w:val="18"/>
                 <w:szCs w:val="18"/>
               </w:rPr>
-              <w:t>Support Phone number and Email can be configured in the Emails sen</w:t>
-            </w:r>
-            <w:r>
-              <w:rPr>
-                <w:rFonts w:asciiTheme="minorHAnsi" w:hAnsiTheme="minorHAnsi" w:cstheme="minorHAnsi"/>
-                <w:sz w:val="18"/>
-                <w:szCs w:val="18"/>
-              </w:rPr>
-              <w:t>t</w:t>
-            </w:r>
-            <w:r>
-              <w:rPr>
-                <w:rFonts w:asciiTheme="minorHAnsi" w:hAnsiTheme="minorHAnsi" w:cstheme="minorHAnsi"/>
-                <w:sz w:val="18"/>
-                <w:szCs w:val="18"/>
-              </w:rPr>
-              <w:t xml:space="preserve"> to Vendors.</w:t>
+              <w:t>Support Phone number and Email can be configured in the Emails sent to Vendors.</w:t>
             </w:r>
           </w:p>
           <w:p>
@@ -6039,25 +5047,7 @@
                 <w:sz w:val="18"/>
                 <w:szCs w:val="18"/>
               </w:rPr>
-              <w:t xml:space="preserve">Vendor </w:t>
-            </w:r>
-            <w:proofErr w:type="gramStart"/>
-            <w:r>
-              <w:rPr>
-                <w:rFonts w:asciiTheme="minorHAnsi" w:hAnsiTheme="minorHAnsi" w:cstheme="minorHAnsi"/>
-                <w:sz w:val="18"/>
-                <w:szCs w:val="18"/>
-              </w:rPr>
-              <w:t>On-boarding</w:t>
-            </w:r>
-            <w:proofErr w:type="gramEnd"/>
-            <w:r>
-              <w:rPr>
-                <w:rFonts w:asciiTheme="minorHAnsi" w:hAnsiTheme="minorHAnsi" w:cstheme="minorHAnsi"/>
-                <w:sz w:val="18"/>
-                <w:szCs w:val="18"/>
-              </w:rPr>
-              <w:t xml:space="preserve"> and Profile Management:</w:t>
+              <w:t>Vendor On-boarding and Profile Management:</w:t>
             </w:r>
           </w:p>
           <w:p>
@@ -6247,23 +5237,7 @@
                 <w:sz w:val="18"/>
                 <w:szCs w:val="18"/>
               </w:rPr>
-              <w:t xml:space="preserve">Vendor self Service </w:t>
-            </w:r>
-            <w:r>
-              <w:rPr>
-                <w:rFonts w:asciiTheme="minorHAnsi" w:hAnsiTheme="minorHAnsi" w:cstheme="minorBidi"/>
-                <w:sz w:val="18"/>
-                <w:szCs w:val="18"/>
-              </w:rPr>
-              <w:t>–</w:t>
-            </w:r>
-            <w:r>
-              <w:rPr>
-                <w:rFonts w:asciiTheme="minorHAnsi" w:hAnsiTheme="minorHAnsi" w:cstheme="minorBidi"/>
-                <w:sz w:val="18"/>
-                <w:szCs w:val="18"/>
-              </w:rPr>
-              <w:t xml:space="preserve"> </w:t>
+              <w:t xml:space="preserve">Vendor self Service – </w:t>
             </w:r>
           </w:p>
           <w:p>
@@ -6279,39 +5253,13 @@
                 <w:szCs w:val="18"/>
               </w:rPr>
             </w:pPr>
-            <w:proofErr w:type="gramStart"/>
-            <w:r>
-              <w:rPr>
-                <w:rFonts w:asciiTheme="minorHAnsi" w:hAnsiTheme="minorHAnsi" w:cstheme="minorHAnsi"/>
-                <w:sz w:val="18"/>
-                <w:szCs w:val="18"/>
-              </w:rPr>
-              <w:t>C</w:t>
-            </w:r>
-            <w:r>
-              <w:rPr>
-                <w:rFonts w:asciiTheme="minorHAnsi" w:hAnsiTheme="minorHAnsi" w:cstheme="minorHAnsi"/>
-                <w:sz w:val="18"/>
-                <w:szCs w:val="18"/>
-              </w:rPr>
-              <w:t>reate</w:t>
-            </w:r>
-            <w:r>
-              <w:rPr>
-                <w:rFonts w:asciiTheme="minorHAnsi" w:hAnsiTheme="minorHAnsi" w:cstheme="minorHAnsi"/>
-                <w:sz w:val="18"/>
-                <w:szCs w:val="18"/>
-              </w:rPr>
-              <w:t>s</w:t>
-            </w:r>
-            <w:proofErr w:type="gramEnd"/>
-            <w:r>
-              <w:rPr>
-                <w:rFonts w:asciiTheme="minorHAnsi" w:hAnsiTheme="minorHAnsi" w:cstheme="minorHAnsi"/>
-                <w:sz w:val="18"/>
-                <w:szCs w:val="18"/>
-              </w:rPr>
-              <w:t xml:space="preserve"> invoices &amp; tie to specific PO or WO</w:t>
+            <w:r>
+              <w:rPr>
+                <w:rFonts w:asciiTheme="minorHAnsi" w:hAnsiTheme="minorHAnsi" w:cstheme="minorHAnsi"/>
+                <w:sz w:val="18"/>
+                <w:szCs w:val="18"/>
+              </w:rPr>
+              <w:t>Creates invoices &amp; tie to specific PO or WO</w:t>
             </w:r>
           </w:p>
           <w:p>
@@ -6405,16 +5353,7 @@
                 <w:sz w:val="18"/>
                 <w:szCs w:val="18"/>
               </w:rPr>
-              <w:t xml:space="preserve">Vendor Café </w:t>
-            </w:r>
-            <w:r>
-              <w:rPr>
-                <w:rFonts w:asciiTheme="minorHAnsi" w:hAnsiTheme="minorHAnsi" w:cstheme="minorHAnsi"/>
-                <w:color w:val="000000"/>
-                <w:sz w:val="18"/>
-                <w:szCs w:val="18"/>
-              </w:rPr>
-              <w:t>TRN – Email combination scenarios</w:t>
+              <w:t>Vendor Café TRN – Email combination scenarios</w:t>
             </w:r>
           </w:p>
         </w:tc>
@@ -6442,111 +5381,7 @@
                 <w:sz w:val="18"/>
                 <w:szCs w:val="18"/>
               </w:rPr>
-              <w:t xml:space="preserve">It is recommended to have Distinct Email </w:t>
-            </w:r>
-            <w:r>
-              <w:rPr>
-                <w:rFonts w:asciiTheme="minorHAnsi" w:hAnsiTheme="minorHAnsi" w:cstheme="minorHAnsi"/>
-                <w:sz w:val="18"/>
-                <w:szCs w:val="18"/>
-              </w:rPr>
-              <w:t>ID</w:t>
-            </w:r>
-            <w:r>
-              <w:rPr>
-                <w:rFonts w:asciiTheme="minorHAnsi" w:hAnsiTheme="minorHAnsi" w:cstheme="minorHAnsi"/>
-                <w:sz w:val="18"/>
-                <w:szCs w:val="18"/>
-              </w:rPr>
-              <w:t xml:space="preserve">s and Tax Registration numbers for Vendors. </w:t>
-            </w:r>
-            <w:r>
-              <w:rPr>
-                <w:rFonts w:asciiTheme="minorHAnsi" w:hAnsiTheme="minorHAnsi" w:cstheme="minorHAnsi"/>
-                <w:sz w:val="18"/>
-                <w:szCs w:val="18"/>
-              </w:rPr>
-              <w:t>I</w:t>
-            </w:r>
-            <w:r>
-              <w:rPr>
-                <w:rFonts w:asciiTheme="minorHAnsi" w:hAnsiTheme="minorHAnsi" w:cstheme="minorHAnsi"/>
-                <w:sz w:val="18"/>
-                <w:szCs w:val="18"/>
-              </w:rPr>
-              <w:t xml:space="preserve">f Vendor needs to log into VC using </w:t>
-            </w:r>
-            <w:r>
-              <w:rPr>
-                <w:rFonts w:asciiTheme="minorHAnsi" w:hAnsiTheme="minorHAnsi" w:cstheme="minorHAnsi"/>
-                <w:sz w:val="18"/>
-                <w:szCs w:val="18"/>
-              </w:rPr>
-              <w:t xml:space="preserve">additional </w:t>
-            </w:r>
-            <w:r>
-              <w:rPr>
-                <w:rFonts w:asciiTheme="minorHAnsi" w:hAnsiTheme="minorHAnsi" w:cstheme="minorHAnsi"/>
-                <w:sz w:val="18"/>
-                <w:szCs w:val="18"/>
-              </w:rPr>
-              <w:t>email id</w:t>
-            </w:r>
-            <w:r>
-              <w:rPr>
-                <w:rFonts w:asciiTheme="minorHAnsi" w:hAnsiTheme="minorHAnsi" w:cstheme="minorHAnsi"/>
-                <w:sz w:val="18"/>
-                <w:szCs w:val="18"/>
-              </w:rPr>
-              <w:t xml:space="preserve">s (apart from the </w:t>
-            </w:r>
-            <w:r>
-              <w:rPr>
-                <w:rFonts w:asciiTheme="minorHAnsi" w:hAnsiTheme="minorHAnsi" w:cstheme="minorHAnsi"/>
-                <w:sz w:val="18"/>
-                <w:szCs w:val="18"/>
-              </w:rPr>
-              <w:t>one used for Registration)</w:t>
-            </w:r>
-            <w:r>
-              <w:rPr>
-                <w:rFonts w:asciiTheme="minorHAnsi" w:hAnsiTheme="minorHAnsi" w:cstheme="minorHAnsi"/>
-                <w:sz w:val="18"/>
-                <w:szCs w:val="18"/>
-              </w:rPr>
-              <w:t xml:space="preserve">, then </w:t>
-            </w:r>
-            <w:r>
-              <w:rPr>
-                <w:rFonts w:asciiTheme="minorHAnsi" w:hAnsiTheme="minorHAnsi" w:cstheme="minorHAnsi"/>
-                <w:sz w:val="18"/>
-                <w:szCs w:val="18"/>
-              </w:rPr>
-              <w:t>Vendor should create Contact</w:t>
-            </w:r>
-            <w:r>
-              <w:rPr>
-                <w:rFonts w:asciiTheme="minorHAnsi" w:hAnsiTheme="minorHAnsi" w:cstheme="minorHAnsi"/>
-                <w:sz w:val="18"/>
-                <w:szCs w:val="18"/>
-              </w:rPr>
-              <w:t>s</w:t>
-            </w:r>
-            <w:r>
-              <w:rPr>
-                <w:rFonts w:asciiTheme="minorHAnsi" w:hAnsiTheme="minorHAnsi" w:cstheme="minorHAnsi"/>
-                <w:sz w:val="18"/>
-                <w:szCs w:val="18"/>
-              </w:rPr>
-              <w:t xml:space="preserve"> in VC </w:t>
-            </w:r>
-            <w:r>
-              <w:rPr>
-                <w:rFonts w:asciiTheme="minorHAnsi" w:hAnsiTheme="minorHAnsi" w:cstheme="minorHAnsi"/>
-                <w:sz w:val="18"/>
-                <w:szCs w:val="18"/>
-              </w:rPr>
-              <w:t>(1 contact per distinct Email id)</w:t>
+              <w:t>It is recommended to have Distinct Email IDs and Tax Registration numbers for Vendors. If Vendor needs to log into VC using additional email ids (apart from the one used for Registration), then Vendor should create Contacts in VC (1 contact per distinct Email id)</w:t>
             </w:r>
           </w:p>
           <w:p>
@@ -6569,15 +5404,7 @@
                 <w:sz w:val="18"/>
                 <w:szCs w:val="18"/>
               </w:rPr>
-              <w:t xml:space="preserve">Below is the system behavior when 2 Vendors with </w:t>
-            </w:r>
-            <w:r>
-              <w:rPr>
-                <w:rFonts w:asciiTheme="minorHAnsi" w:hAnsiTheme="minorHAnsi" w:cstheme="minorHAnsi"/>
-                <w:sz w:val="18"/>
-                <w:szCs w:val="18"/>
-              </w:rPr>
-              <w:t>same Email id OR Tax Registration number OR BOTH are on-boarded for VC</w:t>
+              <w:t>Below is the system behavior when 2 Vendors with same Email id OR Tax Registration number OR BOTH are on-boarded for VC</w:t>
             </w:r>
           </w:p>
           <w:p>
@@ -6718,15 +5545,7 @@
                       <w:sz w:val="18"/>
                       <w:szCs w:val="18"/>
                     </w:rPr>
-                    <w:t xml:space="preserve">Vendor 2 </w:t>
-                  </w:r>
-                  <w:r>
-                    <w:rPr>
-                      <w:rFonts w:asciiTheme="minorHAnsi" w:hAnsiTheme="minorHAnsi" w:cstheme="minorHAnsi"/>
-                      <w:sz w:val="18"/>
-                      <w:szCs w:val="18"/>
-                    </w:rPr>
-                    <w:t>– Created in Voyager with same TRN# and different Email id. Vendor 2 invited to Register in VC</w:t>
+                    <w:t>Vendor 2 – Created in Voyager with same TRN# and different Email id. Vendor 2 invited to Register in VC</w:t>
                   </w:r>
                 </w:p>
               </w:tc>
@@ -6822,55 +5641,7 @@
                       <w:sz w:val="18"/>
                       <w:szCs w:val="18"/>
                     </w:rPr>
-                    <w:t xml:space="preserve">For Vendor 2, TRN# will be </w:t>
-                  </w:r>
-                  <w:r>
-                    <w:rPr>
-                      <w:rFonts w:asciiTheme="minorHAnsi" w:hAnsiTheme="minorHAnsi" w:cstheme="minorHAnsi"/>
-                      <w:sz w:val="18"/>
-                      <w:szCs w:val="18"/>
-                    </w:rPr>
-                    <w:t>auto populated</w:t>
-                  </w:r>
-                  <w:r>
-                    <w:rPr>
-                      <w:rFonts w:asciiTheme="minorHAnsi" w:hAnsiTheme="minorHAnsi" w:cstheme="minorHAnsi"/>
-                      <w:sz w:val="18"/>
-                      <w:szCs w:val="18"/>
-                    </w:rPr>
-                    <w:t xml:space="preserve"> in VC and shall be non-editable. </w:t>
-                  </w:r>
-                  <w:r>
-                    <w:rPr>
-                      <w:rFonts w:asciiTheme="minorHAnsi" w:hAnsiTheme="minorHAnsi" w:cstheme="minorHAnsi"/>
-                      <w:sz w:val="18"/>
-                      <w:szCs w:val="18"/>
-                    </w:rPr>
-                    <w:t xml:space="preserve">Vendor 2 </w:t>
-                  </w:r>
-                  <w:r>
-                    <w:rPr>
-                      <w:rFonts w:asciiTheme="minorHAnsi" w:hAnsiTheme="minorHAnsi" w:cstheme="minorHAnsi"/>
-                      <w:sz w:val="18"/>
-                      <w:szCs w:val="18"/>
-                    </w:rPr>
-                    <w:t>can</w:t>
-                  </w:r>
-                  <w:r>
-                    <w:rPr>
-                      <w:rFonts w:asciiTheme="minorHAnsi" w:hAnsiTheme="minorHAnsi" w:cstheme="minorHAnsi"/>
-                      <w:sz w:val="18"/>
-                      <w:szCs w:val="18"/>
-                    </w:rPr>
-                    <w:t xml:space="preserve"> submit Profile for Approval. After Profile approval both Vendor 1 and Vendor 2 will be </w:t>
-                  </w:r>
-                  <w:r>
-                    <w:rPr>
-                      <w:rFonts w:asciiTheme="minorHAnsi" w:hAnsiTheme="minorHAnsi" w:cstheme="minorHAnsi"/>
-                      <w:sz w:val="18"/>
-                      <w:szCs w:val="18"/>
-                    </w:rPr>
-                    <w:t>listed as distinct main vendors in Vendor Café</w:t>
+                    <w:t>For Vendor 2, TRN# will be auto populated in VC and shall be non-editable. Vendor 2 can submit Profile for Approval. After Profile approval both Vendor 1 and Vendor 2 will be listed as distinct main vendors in Vendor Café</w:t>
                   </w:r>
                 </w:p>
               </w:tc>
@@ -6899,25 +5670,7 @@
                       <w:sz w:val="18"/>
                       <w:szCs w:val="18"/>
                     </w:rPr>
-                    <w:t xml:space="preserve">Vendor 1 </w:t>
-                  </w:r>
-                  <w:proofErr w:type="gramStart"/>
-                  <w:r>
-                    <w:rPr>
-                      <w:rFonts w:asciiTheme="minorHAnsi" w:hAnsiTheme="minorHAnsi" w:cstheme="minorHAnsi"/>
-                      <w:sz w:val="18"/>
-                      <w:szCs w:val="18"/>
-                    </w:rPr>
-                    <w:t>on-boarded</w:t>
-                  </w:r>
-                  <w:proofErr w:type="gramEnd"/>
-                  <w:r>
-                    <w:rPr>
-                      <w:rFonts w:asciiTheme="minorHAnsi" w:hAnsiTheme="minorHAnsi" w:cstheme="minorHAnsi"/>
-                      <w:sz w:val="18"/>
-                      <w:szCs w:val="18"/>
-                    </w:rPr>
-                    <w:t>.</w:t>
+                    <w:t>Vendor 1 on-boarded.</w:t>
                   </w:r>
                 </w:p>
                 <w:p>
@@ -6936,47 +5689,7 @@
                       <w:sz w:val="18"/>
                       <w:szCs w:val="18"/>
                     </w:rPr>
-                    <w:t xml:space="preserve">Vendor 2 with </w:t>
-                  </w:r>
-                  <w:r>
-                    <w:rPr>
-                      <w:rFonts w:asciiTheme="minorHAnsi" w:hAnsiTheme="minorHAnsi" w:cstheme="minorHAnsi"/>
-                      <w:sz w:val="18"/>
-                      <w:szCs w:val="18"/>
-                    </w:rPr>
-                    <w:t>the same</w:t>
-                  </w:r>
-                  <w:r>
-                    <w:rPr>
-                      <w:rFonts w:asciiTheme="minorHAnsi" w:hAnsiTheme="minorHAnsi" w:cstheme="minorHAnsi"/>
-                      <w:sz w:val="18"/>
-                      <w:szCs w:val="18"/>
-                    </w:rPr>
-                    <w:t xml:space="preserve"> Email id </w:t>
-                  </w:r>
-                  <w:r>
-                    <w:rPr>
-                      <w:rFonts w:asciiTheme="minorHAnsi" w:hAnsiTheme="minorHAnsi" w:cstheme="minorHAnsi"/>
-                      <w:sz w:val="18"/>
-                      <w:szCs w:val="18"/>
-                    </w:rPr>
-                    <w:t xml:space="preserve">and TRN# is created and </w:t>
-                  </w:r>
-                  <w:r>
-                    <w:rPr>
-                      <w:rFonts w:asciiTheme="minorHAnsi" w:hAnsiTheme="minorHAnsi" w:cstheme="minorHAnsi"/>
-                      <w:sz w:val="18"/>
-                      <w:szCs w:val="18"/>
-                    </w:rPr>
-                    <w:t>approved</w:t>
-                  </w:r>
-                  <w:r>
-                    <w:rPr>
-                      <w:rFonts w:asciiTheme="minorHAnsi" w:hAnsiTheme="minorHAnsi" w:cstheme="minorHAnsi"/>
-                      <w:sz w:val="18"/>
-                      <w:szCs w:val="18"/>
-                    </w:rPr>
-                    <w:t xml:space="preserve"> in voyager.</w:t>
+                    <w:t>Vendor 2 with the same Email id and TRN# is created and approved in voyager.</w:t>
                   </w:r>
                 </w:p>
                 <w:p>
@@ -7019,15 +5732,7 @@
                       <w:sz w:val="18"/>
                       <w:szCs w:val="18"/>
                     </w:rPr>
-                    <w:t xml:space="preserve">Vendor 2 is not available </w:t>
-                  </w:r>
-                  <w:r>
-                    <w:rPr>
-                      <w:rFonts w:asciiTheme="minorHAnsi" w:hAnsiTheme="minorHAnsi" w:cstheme="minorHAnsi"/>
-                      <w:sz w:val="18"/>
-                      <w:szCs w:val="18"/>
-                    </w:rPr>
-                    <w:t>to be invited for VC.</w:t>
+                    <w:t>Vendor 2 is not available to be invited for VC.</w:t>
                   </w:r>
                 </w:p>
                 <w:p>
@@ -7046,15 +5751,7 @@
                       <w:sz w:val="18"/>
                       <w:szCs w:val="18"/>
                     </w:rPr>
-                    <w:t xml:space="preserve">When Vendor 1 logs into </w:t>
-                  </w:r>
-                  <w:r>
-                    <w:rPr>
-                      <w:rFonts w:asciiTheme="minorHAnsi" w:hAnsiTheme="minorHAnsi" w:cstheme="minorHAnsi"/>
-                      <w:sz w:val="18"/>
-                      <w:szCs w:val="18"/>
-                    </w:rPr>
-                    <w:t>VC, Vendor 2 is listed as a Sub-Vendor to Vendor 1</w:t>
+                    <w:t>When Vendor 1 logs into VC, Vendor 2 is listed as a Sub-Vendor to Vendor 1</w:t>
                   </w:r>
                 </w:p>
               </w:tc>
@@ -7151,47 +5848,7 @@
           <w:szCs w:val="22"/>
           <w:u w:val="single"/>
         </w:rPr>
-        <w:t xml:space="preserve">Additional </w:t>
-      </w:r>
-      <w:r>
-        <w:rPr>
-          <w:rFonts w:asciiTheme="minorHAnsi" w:hAnsiTheme="minorHAnsi"/>
-          <w:b/>
-          <w:sz w:val="22"/>
-          <w:szCs w:val="22"/>
-          <w:u w:val="single"/>
-        </w:rPr>
-        <w:t>Requirements</w:t>
-      </w:r>
-      <w:r>
-        <w:rPr>
-          <w:rFonts w:asciiTheme="minorHAnsi" w:hAnsiTheme="minorHAnsi"/>
-          <w:b/>
-          <w:sz w:val="22"/>
-          <w:szCs w:val="22"/>
-          <w:u w:val="single"/>
-        </w:rPr>
-        <w:t xml:space="preserve"> </w:t>
-      </w:r>
-      <w:r>
-        <w:rPr>
-          <w:rFonts w:asciiTheme="minorHAnsi" w:hAnsiTheme="minorHAnsi"/>
-          <w:b/>
-          <w:sz w:val="22"/>
-          <w:szCs w:val="22"/>
-          <w:u w:val="single"/>
-        </w:rPr>
-        <w:t>raised</w:t>
-      </w:r>
-      <w:r>
-        <w:rPr>
-          <w:rFonts w:asciiTheme="minorHAnsi" w:hAnsiTheme="minorHAnsi"/>
-          <w:b/>
-          <w:sz w:val="22"/>
-          <w:szCs w:val="22"/>
-          <w:u w:val="single"/>
-        </w:rPr>
-        <w:t xml:space="preserve"> during the BPR Session</w:t>
+        <w:t>Additional Requirements raised during the BPR Session</w:t>
       </w:r>
       <w:r>
         <w:rPr>
@@ -7429,39 +6086,7 @@
           <w:sz w:val="20"/>
           <w:szCs w:val="20"/>
         </w:rPr>
-        <w:t xml:space="preserve">RFI </w:t>
-      </w:r>
-      <w:r>
-        <w:rPr>
-          <w:rFonts w:asciiTheme="minorHAnsi" w:hAnsiTheme="minorHAnsi" w:cstheme="minorBidi"/>
-          <w:sz w:val="20"/>
-          <w:szCs w:val="20"/>
-        </w:rPr>
-        <w:t>Items:</w:t>
-      </w:r>
-      <w:r>
-        <w:rPr>
-          <w:rFonts w:asciiTheme="minorHAnsi" w:hAnsiTheme="minorHAnsi" w:cstheme="minorBidi"/>
-          <w:sz w:val="20"/>
-          <w:szCs w:val="20"/>
-        </w:rPr>
-        <w:t xml:space="preserve"> Refer RFI document on </w:t>
-      </w:r>
-      <w:r>
-        <w:rPr>
-          <w:rFonts w:asciiTheme="minorHAnsi" w:hAnsiTheme="minorHAnsi" w:cstheme="minorBidi"/>
-          <w:sz w:val="20"/>
-          <w:szCs w:val="20"/>
-        </w:rPr>
-        <w:t>SharePoint</w:t>
-      </w:r>
-      <w:r>
-        <w:rPr>
-          <w:rFonts w:asciiTheme="minorHAnsi" w:hAnsiTheme="minorHAnsi" w:cstheme="minorBidi"/>
-          <w:sz w:val="20"/>
-          <w:szCs w:val="20"/>
-        </w:rPr>
-        <w:t>.</w:t>
+        <w:t>RFI Items: Refer RFI document on SharePoint.</w:t>
       </w:r>
       <w:bookmarkEnd w:id="18"/>
       <w:bookmarkEnd w:id="19"/>

</xml_diff>